<commit_message>
Completed Software Installation Failure lab documentation and screenshots
</commit_message>
<xml_diff>
--- a/Enterprise_Systems_VM_Buildout_Workbook_Rob_Style.docx
+++ b/Enterprise_Systems_VM_Buildout_Workbook_Rob_Style.docx
@@ -77,11 +77,6 @@
           <w:sz w:val="20"/>
         </w:rPr>
         <w:br/>
-      </w:r>
-      <w:r>
-        <w:rPr>
-          <w:sz w:val="20"/>
-        </w:rPr>
         <w:t>Purpose: Build the full virtual lab environment before running the enterprise troubleshooting labs. This workbook is designed for printable documentation, screen print evidence, GitHub proof, and ePortfolio presentation.</w:t>
       </w:r>
     </w:p>
@@ -191,13 +186,18 @@
         <w:rPr>
           <w:sz w:val="18"/>
         </w:rPr>
-        <w:t>☐</w:t>
-      </w:r>
+        <w:t>☐ LAB 03 - Windows Services Failure Recovery</w:t>
+      </w:r>
+    </w:p>
+    <w:p>
+      <w:pPr>
+        <w:ind w:left="360"/>
+      </w:pPr>
       <w:r>
         <w:rPr>
           <w:sz w:val="18"/>
         </w:rPr>
-        <w:t xml:space="preserve"> LAB 03 - Windows Services Failure Recovery</w:t>
+        <w:t>☐ LAB 04 - Network Connectivity and DNS Troubleshooting</w:t>
       </w:r>
     </w:p>
     <w:p>
@@ -208,13 +208,18 @@
         <w:rPr>
           <w:sz w:val="18"/>
         </w:rPr>
-        <w:t>☐</w:t>
-      </w:r>
+        <w:t>☐ LAB 05 - Event Viewer and System Log Analysis</w:t>
+      </w:r>
+    </w:p>
+    <w:p>
+      <w:pPr>
+        <w:ind w:left="360"/>
+      </w:pPr>
       <w:r>
         <w:rPr>
           <w:sz w:val="18"/>
         </w:rPr>
-        <w:t xml:space="preserve"> LAB 04 - Network Connectivity and DNS Troubleshooting</w:t>
+        <w:t>☐ LAB 06 - Remote Support Workflow Simulation</w:t>
       </w:r>
     </w:p>
     <w:p>
@@ -225,64 +230,18 @@
         <w:rPr>
           <w:sz w:val="18"/>
         </w:rPr>
-        <w:t>☐</w:t>
-      </w:r>
+        <w:t>☐ LAB 07 - Ticketing, Documentation and SLA Escalation Operations</w:t>
+      </w:r>
+    </w:p>
+    <w:p>
+      <w:pPr>
+        <w:ind w:left="360"/>
+      </w:pPr>
       <w:r>
         <w:rPr>
           <w:sz w:val="18"/>
         </w:rPr>
-        <w:t xml:space="preserve"> LAB 05 - Event Viewer and System Log Analysis</w:t>
-      </w:r>
-    </w:p>
-    <w:p>
-      <w:pPr>
-        <w:ind w:left="360"/>
-      </w:pPr>
-      <w:r>
-        <w:rPr>
-          <w:sz w:val="18"/>
-        </w:rPr>
-        <w:t>☐</w:t>
-      </w:r>
-      <w:r>
-        <w:rPr>
-          <w:sz w:val="18"/>
-        </w:rPr>
-        <w:t xml:space="preserve"> LAB 06 - Remote Support Workflow Simulation</w:t>
-      </w:r>
-    </w:p>
-    <w:p>
-      <w:pPr>
-        <w:ind w:left="360"/>
-      </w:pPr>
-      <w:r>
-        <w:rPr>
-          <w:sz w:val="18"/>
-        </w:rPr>
-        <w:t>☐</w:t>
-      </w:r>
-      <w:r>
-        <w:rPr>
-          <w:sz w:val="18"/>
-        </w:rPr>
-        <w:t xml:space="preserve"> LAB 07 - Ticketing, Documentation and SLA Escalation Operations</w:t>
-      </w:r>
-    </w:p>
-    <w:p>
-      <w:pPr>
-        <w:ind w:left="360"/>
-      </w:pPr>
-      <w:r>
-        <w:rPr>
-          <w:sz w:val="18"/>
-        </w:rPr>
-        <w:t>☐</w:t>
-      </w:r>
-      <w:r>
-        <w:rPr>
-          <w:sz w:val="18"/>
-        </w:rPr>
-        <w:t xml:space="preserve"> LAB 08 - End-to-End Enterprise Incident Resolution Simulation</w:t>
+        <w:t>☐ LAB 08 - End-to-End Enterprise Incident Resolution Simulation</w:t>
       </w:r>
     </w:p>
     <w:p>
@@ -946,6 +905,7 @@
             <w:r>
               <w:rPr>
                 <w:b/>
+                <w:noProof/>
                 <w:color w:val="787878"/>
                 <w:sz w:val="28"/>
               </w:rPr>
@@ -1086,6 +1046,7 @@
             <w:r>
               <w:rPr>
                 <w:b/>
+                <w:noProof/>
                 <w:color w:val="787878"/>
                 <w:sz w:val="28"/>
               </w:rPr>
@@ -1226,6 +1187,7 @@
             <w:r>
               <w:rPr>
                 <w:b/>
+                <w:noProof/>
                 <w:color w:val="787878"/>
                 <w:sz w:val="28"/>
               </w:rPr>
@@ -1569,6 +1531,7 @@
             <w:r>
               <w:rPr>
                 <w:b/>
+                <w:noProof/>
                 <w:color w:val="787878"/>
                 <w:sz w:val="28"/>
               </w:rPr>
@@ -1701,6 +1664,7 @@
             <w:r>
               <w:rPr>
                 <w:b/>
+                <w:noProof/>
                 <w:color w:val="787878"/>
                 <w:sz w:val="28"/>
               </w:rPr>
@@ -2003,6 +1967,7 @@
             <w:r>
               <w:rPr>
                 <w:b/>
+                <w:noProof/>
                 <w:color w:val="787878"/>
                 <w:sz w:val="28"/>
               </w:rPr>
@@ -3410,6 +3375,7 @@
             <w:r>
               <w:rPr>
                 <w:b/>
+                <w:noProof/>
                 <w:color w:val="787878"/>
                 <w:sz w:val="28"/>
               </w:rPr>
@@ -3586,6 +3552,7 @@
             <w:r>
               <w:rPr>
                 <w:b/>
+                <w:noProof/>
                 <w:color w:val="787878"/>
                 <w:sz w:val="28"/>
               </w:rPr>
@@ -5125,6 +5092,7 @@
             <w:r>
               <w:rPr>
                 <w:b/>
+                <w:noProof/>
                 <w:color w:val="787878"/>
                 <w:sz w:val="28"/>
               </w:rPr>
@@ -5264,6 +5232,7 @@
             <w:r>
               <w:rPr>
                 <w:b/>
+                <w:noProof/>
                 <w:color w:val="787878"/>
                 <w:sz w:val="28"/>
               </w:rPr>
@@ -5405,6 +5374,7 @@
             <w:r>
               <w:rPr>
                 <w:b/>
+                <w:noProof/>
                 <w:color w:val="787878"/>
                 <w:sz w:val="28"/>
               </w:rPr>
@@ -5461,6 +5431,9 @@
               <w:jc w:val="center"/>
             </w:pPr>
             <w:r>
+              <w:rPr>
+                <w:noProof/>
+              </w:rPr>
               <w:lastRenderedPageBreak/>
               <w:drawing>
                 <wp:inline distT="0" distB="0" distL="0" distR="0" wp14:anchorId="7CB33A05" wp14:editId="02C5CE0D">
@@ -5821,6 +5794,7 @@
             <w:r>
               <w:rPr>
                 <w:b/>
+                <w:noProof/>
                 <w:color w:val="787878"/>
                 <w:sz w:val="28"/>
               </w:rPr>
@@ -5961,6 +5935,7 @@
             <w:r>
               <w:rPr>
                 <w:b/>
+                <w:noProof/>
                 <w:color w:val="787878"/>
                 <w:sz w:val="28"/>
               </w:rPr>
@@ -6084,6 +6059,7 @@
             <w:r>
               <w:rPr>
                 <w:b/>
+                <w:noProof/>
                 <w:color w:val="787878"/>
                 <w:sz w:val="28"/>
               </w:rPr>
@@ -6445,6 +6421,7 @@
             <w:r>
               <w:rPr>
                 <w:b/>
+                <w:noProof/>
                 <w:color w:val="787878"/>
                 <w:sz w:val="28"/>
               </w:rPr>
@@ -6500,6 +6477,9 @@
               <w:jc w:val="center"/>
             </w:pPr>
             <w:r>
+              <w:rPr>
+                <w:noProof/>
+              </w:rPr>
               <w:lastRenderedPageBreak/>
               <w:drawing>
                 <wp:inline distT="0" distB="0" distL="0" distR="0" wp14:anchorId="703373BA" wp14:editId="00EB970B">
@@ -6543,6 +6523,9 @@
               <w:jc w:val="center"/>
             </w:pPr>
             <w:r>
+              <w:rPr>
+                <w:noProof/>
+              </w:rPr>
               <w:drawing>
                 <wp:inline distT="0" distB="0" distL="0" distR="0" wp14:anchorId="14C089D1" wp14:editId="3973D950">
                   <wp:extent cx="6142252" cy="4473328"/>
@@ -6590,6 +6573,9 @@
               <w:jc w:val="center"/>
             </w:pPr>
             <w:r>
+              <w:rPr>
+                <w:noProof/>
+              </w:rPr>
               <w:drawing>
                 <wp:inline distT="0" distB="0" distL="0" distR="0" wp14:anchorId="2C06B6D1" wp14:editId="18A0402D">
                   <wp:extent cx="2766300" cy="2796782"/>
@@ -6642,6 +6628,9 @@
               <w:jc w:val="center"/>
             </w:pPr>
             <w:r>
+              <w:rPr>
+                <w:noProof/>
+              </w:rPr>
               <w:drawing>
                 <wp:inline distT="0" distB="0" distL="0" distR="0" wp14:anchorId="0D0B660B" wp14:editId="09567D21">
                   <wp:extent cx="6583680" cy="3562985"/>
@@ -6788,6 +6777,7 @@
             <w:r>
               <w:rPr>
                 <w:b/>
+                <w:noProof/>
                 <w:color w:val="787878"/>
                 <w:sz w:val="28"/>
               </w:rPr>
@@ -6844,6 +6834,9 @@
               <w:jc w:val="center"/>
             </w:pPr>
             <w:r>
+              <w:rPr>
+                <w:noProof/>
+              </w:rPr>
               <w:drawing>
                 <wp:inline distT="0" distB="0" distL="0" distR="0" wp14:anchorId="734DD438" wp14:editId="0BD34FE6">
                   <wp:extent cx="4473328" cy="1615580"/>
@@ -6891,6 +6884,9 @@
               <w:jc w:val="center"/>
             </w:pPr>
             <w:r>
+              <w:rPr>
+                <w:noProof/>
+              </w:rPr>
               <w:drawing>
                 <wp:inline distT="0" distB="0" distL="0" distR="0" wp14:anchorId="2387D42D" wp14:editId="2CE3858F">
                   <wp:extent cx="4054191" cy="1646063"/>
@@ -6938,6 +6934,9 @@
               <w:jc w:val="center"/>
             </w:pPr>
             <w:r>
+              <w:rPr>
+                <w:noProof/>
+              </w:rPr>
               <w:lastRenderedPageBreak/>
               <w:drawing>
                 <wp:inline distT="0" distB="0" distL="0" distR="0" wp14:anchorId="774868E9" wp14:editId="2FEDACB4">
@@ -7067,6 +7066,7 @@
             <w:r>
               <w:rPr>
                 <w:b/>
+                <w:noProof/>
                 <w:color w:val="787878"/>
                 <w:sz w:val="28"/>
               </w:rPr>
@@ -7923,7 +7923,19 @@
         <w:rPr>
           <w:sz w:val="18"/>
         </w:rPr>
-        <w:t>Add a short written note explaining that this VM is the baseline environment for Labs 03-08.</w:t>
+        <w:t xml:space="preserve">Add a </w:t>
+      </w:r>
+      <w:r>
+        <w:rPr>
+          <w:sz w:val="18"/>
+        </w:rPr>
+        <w:t>short-written</w:t>
+      </w:r>
+      <w:r>
+        <w:rPr>
+          <w:sz w:val="18"/>
+        </w:rPr>
+        <w:t xml:space="preserve"> note explaining that this VM is the baseline environment for Labs 03-08.</w:t>
       </w:r>
     </w:p>
     <w:p>

</xml_diff>